<commit_message>
docs: adendo de evolu��o e-commerce na proposta
Cl�usula 11 nova oferece evolu��o opcional para plataforma online de venda
de fotos, com desconto promocional de 15% e cr�dito integral da implanta��o
atual (saldo de R$ 6.250). Mensalidade em dois planos (R$ 700 / R$ 1.000)
com SLAs diferenciados. Validade de 12 meses ap�s assinatura.

Co-Authored-By: Claude Opus 4.7 <noreply@anthropic.com>
</commit_message>
<xml_diff>
--- a/docs/proposta/proposta-eduardo-santana-producoes.docx
+++ b/docs/proposta/proposta-eduardo-santana-producoes.docx
@@ -2236,7 +2236,952 @@
           <w:color w:val="0A7D4E"/>
           <w:sz w:val="28"/>
         </w:rPr>
-        <w:t>11. Aceite</w:t>
+        <w:t>11. Adendo � Evolu��o para Plataforma E-commerce de Fotos</w:t>
+      </w:r>
+    </w:p>
+    <w:p>
+      <w:pPr>
+        <w:spacing w:after="120"/>
+      </w:pPr>
+      <w:r>
+        <w:rPr>
+          <w:sz w:val="20"/>
+        </w:rPr>
+        <w:t>Como cortesia ao cliente desta proposta, oferecemos a possibilidade de evoluir a aplica��o local atual para uma plataforma online de venda de fotos, hospedada em infraestrutura cloud profissional. Esta evolu��o � opcional e pode ser contratada a qualquer momento dentro de 12 meses ap�s a entrega da aplica��o original.</w:t>
+      </w:r>
+    </w:p>
+    <w:p>
+      <w:pPr>
+        <w:spacing w:before="200" w:after="80"/>
+      </w:pPr>
+      <w:r>
+        <w:rPr>
+          <w:b/>
+          <w:color w:val="1A1A1A"/>
+          <w:sz w:val="22"/>
+        </w:rPr>
+        <w:t>O que muda</w:t>
+      </w:r>
+    </w:p>
+    <w:p>
+      <w:pPr>
+        <w:spacing w:after="120"/>
+      </w:pPr>
+      <w:r>
+        <w:rPr>
+          <w:sz w:val="20"/>
+        </w:rPr>
+        <w:t>A solu��o atual (uso interno, instala��o local) � transformada em uma plataforma web acess�vel ao p�blico final, permitindo que os convidados/participantes dos eventos comprem suas pr�prias fotos diretamente online, sem intermedia��o manual.</w:t>
+      </w:r>
+    </w:p>
+    <w:p>
+      <w:pPr>
+        <w:spacing w:before="200" w:after="80"/>
+      </w:pPr>
+      <w:r>
+        <w:rPr>
+          <w:b/>
+          <w:color w:val="1A1A1A"/>
+          <w:sz w:val="22"/>
+        </w:rPr>
+        <w:t>Funcionalidades adicionais inclu�das</w:t>
+      </w:r>
+    </w:p>
+    <w:p>
+      <w:pPr>
+        <w:pStyle w:val="ListBullet"/>
+      </w:pPr>
+      <w:r>
+        <w:rPr>
+          <w:sz w:val="20"/>
+        </w:rPr>
+        <w:t>Cat�logo p�blico de eventos e �lbuns</w:t>
+      </w:r>
+    </w:p>
+    <w:p>
+      <w:pPr>
+        <w:pStyle w:val="ListBullet"/>
+      </w:pPr>
+      <w:r>
+        <w:rPr>
+          <w:sz w:val="20"/>
+        </w:rPr>
+        <w:t>Reconhecimento facial integrado (o visitante envia uma selfie e a plataforma localiza automaticamente todas as fotos em que ele aparece)</w:t>
+      </w:r>
+    </w:p>
+    <w:p>
+      <w:pPr>
+        <w:pStyle w:val="ListBullet"/>
+      </w:pPr>
+      <w:r>
+        <w:rPr>
+          <w:sz w:val="20"/>
+        </w:rPr>
+        <w:t>Carrinho de compras e checkout integrado a gateway de pagamento</w:t>
+      </w:r>
+    </w:p>
+    <w:p>
+      <w:pPr>
+        <w:pStyle w:val="ListBullet"/>
+      </w:pPr>
+      <w:r>
+        <w:rPr>
+          <w:sz w:val="20"/>
+        </w:rPr>
+        <w:t>Painel administrativo para gest�o de eventos, pre�os e relat�rios de venda</w:t>
+      </w:r>
+    </w:p>
+    <w:p>
+      <w:pPr>
+        <w:pStyle w:val="ListBullet"/>
+      </w:pPr>
+      <w:r>
+        <w:rPr>
+          <w:sz w:val="20"/>
+        </w:rPr>
+        <w:t>�rea do cliente (login do comprador, hist�rico de pedidos, downloads liberados)</w:t>
+      </w:r>
+    </w:p>
+    <w:p>
+      <w:pPr>
+        <w:pStyle w:val="ListBullet"/>
+      </w:pPr>
+      <w:r>
+        <w:rPr>
+          <w:sz w:val="20"/>
+        </w:rPr>
+        <w:t>Marca d'�gua autom�tica nas pr�vias e remo��o ap�s pagamento</w:t>
+      </w:r>
+    </w:p>
+    <w:p>
+      <w:pPr>
+        <w:pStyle w:val="ListBullet"/>
+      </w:pPr>
+      <w:r>
+        <w:rPr>
+          <w:sz w:val="20"/>
+        </w:rPr>
+        <w:t>Dom�nio pr�prio (.com.br a definir pelo cliente, sujeito � disponibilidade no registro.br)</w:t>
+      </w:r>
+    </w:p>
+    <w:p>
+      <w:pPr>
+        <w:pStyle w:val="ListBullet"/>
+      </w:pPr>
+      <w:r>
+        <w:rPr>
+          <w:sz w:val="20"/>
+        </w:rPr>
+        <w:t>Certificado SSL e prote��o DDoS b�sica</w:t>
+      </w:r>
+    </w:p>
+    <w:p>
+      <w:pPr>
+        <w:pStyle w:val="ListBullet"/>
+      </w:pPr>
+      <w:r>
+        <w:rPr>
+          <w:sz w:val="20"/>
+        </w:rPr>
+        <w:t>Layout responsivo para celular, tablet e desktop</w:t>
+      </w:r>
+    </w:p>
+    <w:p>
+      <w:pPr>
+        <w:spacing w:before="200" w:after="80"/>
+      </w:pPr>
+      <w:r>
+        <w:rPr>
+          <w:b/>
+          <w:color w:val="1A1A1A"/>
+          <w:sz w:val="22"/>
+        </w:rPr>
+        <w:t>Investimento da evolu��o</w:t>
+      </w:r>
+    </w:p>
+    <w:tbl>
+      <w:tblPr>
+        <w:tblStyle w:val="LightGrid-Accent1"/>
+        <w:tblW w:type="auto" w:w="0"/>
+        <w:tblLook w:firstColumn="1" w:firstRow="1" w:lastColumn="0" w:lastRow="0" w:noHBand="0" w:noVBand="1" w:val="04A0"/>
+      </w:tblPr>
+      <w:tblGrid>
+        <w:gridCol w:w="4873"/>
+        <w:gridCol w:w="4873"/>
+      </w:tblGrid>
+      <w:tr>
+        <w:tc>
+          <w:tcPr>
+            <w:tcW w:type="dxa" w:w="4873"/>
+            <w:shd w:val="clear" w:color="auto" w:fill="E8F5EE"/>
+          </w:tcPr>
+          <w:p>
+            <w:r/>
+            <w:r>
+              <w:rPr>
+                <w:b/>
+                <w:color w:val="0A7D4E"/>
+                <w:sz w:val="18"/>
+              </w:rPr>
+              <w:t>Item</w:t>
+            </w:r>
+          </w:p>
+        </w:tc>
+        <w:tc>
+          <w:tcPr>
+            <w:tcW w:type="dxa" w:w="4873"/>
+            <w:shd w:val="clear" w:color="auto" w:fill="E8F5EE"/>
+          </w:tcPr>
+          <w:p>
+            <w:r/>
+            <w:r>
+              <w:rPr>
+                <w:b/>
+                <w:color w:val="0A7D4E"/>
+                <w:sz w:val="18"/>
+              </w:rPr>
+              <w:t>Valor</w:t>
+            </w:r>
+          </w:p>
+        </w:tc>
+      </w:tr>
+      <w:tr>
+        <w:tc>
+          <w:tcPr>
+            <w:tcW w:type="dxa" w:w="4873"/>
+          </w:tcPr>
+          <w:p>
+            <w:r/>
+            <w:r>
+              <w:rPr>
+                <w:sz w:val="18"/>
+              </w:rPr>
+              <w:t>Valor cheio do desenvolvimento da plataforma</w:t>
+            </w:r>
+          </w:p>
+        </w:tc>
+        <w:tc>
+          <w:tcPr>
+            <w:tcW w:type="dxa" w:w="4873"/>
+          </w:tcPr>
+          <w:p>
+            <w:r/>
+            <w:r>
+              <w:rPr>
+                <w:sz w:val="18"/>
+              </w:rPr>
+              <w:t>R$ 15.000,00</w:t>
+            </w:r>
+          </w:p>
+        </w:tc>
+      </w:tr>
+      <w:tr>
+        <w:tc>
+          <w:tcPr>
+            <w:tcW w:type="dxa" w:w="4873"/>
+          </w:tcPr>
+          <w:p>
+            <w:r/>
+            <w:r>
+              <w:rPr>
+                <w:sz w:val="18"/>
+              </w:rPr>
+              <w:t>Desconto promocional (15%)</w:t>
+            </w:r>
+          </w:p>
+        </w:tc>
+        <w:tc>
+          <w:tcPr>
+            <w:tcW w:type="dxa" w:w="4873"/>
+          </w:tcPr>
+          <w:p>
+            <w:r/>
+            <w:r>
+              <w:rPr>
+                <w:sz w:val="18"/>
+              </w:rPr>
+              <w:t>- R$ 2.250,00</w:t>
+            </w:r>
+          </w:p>
+        </w:tc>
+      </w:tr>
+      <w:tr>
+        <w:tc>
+          <w:tcPr>
+            <w:tcW w:type="dxa" w:w="4873"/>
+          </w:tcPr>
+          <w:p>
+            <w:r/>
+            <w:r>
+              <w:rPr>
+                <w:sz w:val="18"/>
+              </w:rPr>
+              <w:t>Cr�dito da implanta��o atual (Cl�usula 10)</w:t>
+            </w:r>
+          </w:p>
+        </w:tc>
+        <w:tc>
+          <w:tcPr>
+            <w:tcW w:type="dxa" w:w="4873"/>
+          </w:tcPr>
+          <w:p>
+            <w:r/>
+            <w:r>
+              <w:rPr>
+                <w:sz w:val="18"/>
+              </w:rPr>
+              <w:t>- R$ 6.500,00</w:t>
+            </w:r>
+          </w:p>
+        </w:tc>
+      </w:tr>
+      <w:tr>
+        <w:tc>
+          <w:tcPr>
+            <w:tcW w:type="dxa" w:w="4873"/>
+          </w:tcPr>
+          <w:p>
+            <w:r/>
+            <w:r>
+              <w:rPr>
+                <w:sz w:val="18"/>
+              </w:rPr>
+              <w:t>Saldo a pagar pela evolu��o</w:t>
+            </w:r>
+          </w:p>
+        </w:tc>
+        <w:tc>
+          <w:tcPr>
+            <w:tcW w:type="dxa" w:w="4873"/>
+          </w:tcPr>
+          <w:p>
+            <w:r/>
+            <w:r>
+              <w:rPr>
+                <w:sz w:val="18"/>
+              </w:rPr>
+              <w:t>R$ 6.250,00</w:t>
+            </w:r>
+          </w:p>
+        </w:tc>
+      </w:tr>
+    </w:tbl>
+    <w:p>
+      <w:pPr>
+        <w:spacing w:after="120"/>
+      </w:pPr>
+      <w:r>
+        <w:rPr>
+          <w:b/>
+          <w:sz w:val="20"/>
+        </w:rPr>
+        <w:t>Forma de pagamento do saldo: 50% na assinatura do adendo + 50% na entrega da plataforma.</w:t>
+      </w:r>
+    </w:p>
+    <w:p>
+      <w:pPr>
+        <w:spacing w:before="200" w:after="80"/>
+      </w:pPr>
+      <w:r>
+        <w:rPr>
+          <w:b/>
+          <w:color w:val="1A1A1A"/>
+          <w:sz w:val="22"/>
+        </w:rPr>
+        <w:t>Mensalidade ap�s o go-live</w:t>
+      </w:r>
+    </w:p>
+    <w:p>
+      <w:pPr>
+        <w:spacing w:after="120"/>
+      </w:pPr>
+      <w:r>
+        <w:rPr>
+          <w:sz w:val="20"/>
+        </w:rPr>
+        <w:t>A plataforma online exige hospedagem cloud, monitoramento e suporte cont�nuos. O cliente escolhe entre dois planos:</w:t>
+      </w:r>
+    </w:p>
+    <w:tbl>
+      <w:tblPr>
+        <w:tblStyle w:val="LightGrid-Accent1"/>
+        <w:tblW w:type="auto" w:w="0"/>
+        <w:tblLook w:firstColumn="1" w:firstRow="1" w:lastColumn="0" w:lastRow="0" w:noHBand="0" w:noVBand="1" w:val="04A0"/>
+      </w:tblPr>
+      <w:tblGrid>
+        <w:gridCol w:w="3249"/>
+        <w:gridCol w:w="3249"/>
+        <w:gridCol w:w="3249"/>
+      </w:tblGrid>
+      <w:tr>
+        <w:tc>
+          <w:tcPr>
+            <w:tcW w:type="dxa" w:w="3249"/>
+            <w:shd w:val="clear" w:color="auto" w:fill="E8F5EE"/>
+          </w:tcPr>
+          <w:p>
+            <w:r/>
+            <w:r>
+              <w:rPr>
+                <w:b/>
+                <w:color w:val="0A7D4E"/>
+                <w:sz w:val="18"/>
+              </w:rPr>
+              <w:t>Item</w:t>
+            </w:r>
+          </w:p>
+        </w:tc>
+        <w:tc>
+          <w:tcPr>
+            <w:tcW w:type="dxa" w:w="3249"/>
+            <w:shd w:val="clear" w:color="auto" w:fill="E8F5EE"/>
+          </w:tcPr>
+          <w:p>
+            <w:r/>
+            <w:r>
+              <w:rPr>
+                <w:b/>
+                <w:color w:val="0A7D4E"/>
+                <w:sz w:val="18"/>
+              </w:rPr>
+              <w:t>Essencial</w:t>
+            </w:r>
+          </w:p>
+        </w:tc>
+        <w:tc>
+          <w:tcPr>
+            <w:tcW w:type="dxa" w:w="3249"/>
+            <w:shd w:val="clear" w:color="auto" w:fill="E8F5EE"/>
+          </w:tcPr>
+          <w:p>
+            <w:r/>
+            <w:r>
+              <w:rPr>
+                <w:b/>
+                <w:color w:val="0A7D4E"/>
+                <w:sz w:val="18"/>
+              </w:rPr>
+              <w:t>Completo</w:t>
+            </w:r>
+          </w:p>
+        </w:tc>
+      </w:tr>
+      <w:tr>
+        <w:tc>
+          <w:tcPr>
+            <w:tcW w:type="dxa" w:w="3249"/>
+          </w:tcPr>
+          <w:p>
+            <w:r/>
+            <w:r>
+              <w:rPr>
+                <w:sz w:val="18"/>
+              </w:rPr>
+              <w:t>Mensalidade</w:t>
+            </w:r>
+          </w:p>
+        </w:tc>
+        <w:tc>
+          <w:tcPr>
+            <w:tcW w:type="dxa" w:w="3249"/>
+          </w:tcPr>
+          <w:p>
+            <w:r/>
+            <w:r>
+              <w:rPr>
+                <w:sz w:val="18"/>
+              </w:rPr>
+              <w:t>R$ 700/m�s</w:t>
+            </w:r>
+          </w:p>
+        </w:tc>
+        <w:tc>
+          <w:tcPr>
+            <w:tcW w:type="dxa" w:w="3249"/>
+          </w:tcPr>
+          <w:p>
+            <w:r/>
+            <w:r>
+              <w:rPr>
+                <w:sz w:val="18"/>
+              </w:rPr>
+              <w:t>R$ 1.000/m�s</w:t>
+            </w:r>
+          </w:p>
+        </w:tc>
+      </w:tr>
+      <w:tr>
+        <w:tc>
+          <w:tcPr>
+            <w:tcW w:type="dxa" w:w="3249"/>
+          </w:tcPr>
+          <w:p>
+            <w:r/>
+            <w:r>
+              <w:rPr>
+                <w:sz w:val="18"/>
+              </w:rPr>
+              <w:t>Infraestrutura cloud gerenciada</w:t>
+            </w:r>
+          </w:p>
+        </w:tc>
+        <w:tc>
+          <w:tcPr>
+            <w:tcW w:type="dxa" w:w="3249"/>
+          </w:tcPr>
+          <w:p>
+            <w:r/>
+            <w:r>
+              <w:rPr>
+                <w:sz w:val="18"/>
+              </w:rPr>
+              <w:t>Sim</w:t>
+            </w:r>
+          </w:p>
+        </w:tc>
+        <w:tc>
+          <w:tcPr>
+            <w:tcW w:type="dxa" w:w="3249"/>
+          </w:tcPr>
+          <w:p>
+            <w:r/>
+            <w:r>
+              <w:rPr>
+                <w:sz w:val="18"/>
+              </w:rPr>
+              <w:t>Sim</w:t>
+            </w:r>
+          </w:p>
+        </w:tc>
+      </w:tr>
+      <w:tr>
+        <w:tc>
+          <w:tcPr>
+            <w:tcW w:type="dxa" w:w="3249"/>
+          </w:tcPr>
+          <w:p>
+            <w:r/>
+            <w:r>
+              <w:rPr>
+                <w:sz w:val="18"/>
+              </w:rPr>
+              <w:t>Backups autom�ticos di�rios</w:t>
+            </w:r>
+          </w:p>
+        </w:tc>
+        <w:tc>
+          <w:tcPr>
+            <w:tcW w:type="dxa" w:w="3249"/>
+          </w:tcPr>
+          <w:p>
+            <w:r/>
+            <w:r>
+              <w:rPr>
+                <w:sz w:val="18"/>
+              </w:rPr>
+              <w:t>Sim</w:t>
+            </w:r>
+          </w:p>
+        </w:tc>
+        <w:tc>
+          <w:tcPr>
+            <w:tcW w:type="dxa" w:w="3249"/>
+          </w:tcPr>
+          <w:p>
+            <w:r/>
+            <w:r>
+              <w:rPr>
+                <w:sz w:val="18"/>
+              </w:rPr>
+              <w:t>Sim</w:t>
+            </w:r>
+          </w:p>
+        </w:tc>
+      </w:tr>
+      <w:tr>
+        <w:tc>
+          <w:tcPr>
+            <w:tcW w:type="dxa" w:w="3249"/>
+          </w:tcPr>
+          <w:p>
+            <w:r/>
+            <w:r>
+              <w:rPr>
+                <w:sz w:val="18"/>
+              </w:rPr>
+              <w:t>Dom�nio .com.br (renova��o anual)</w:t>
+            </w:r>
+          </w:p>
+        </w:tc>
+        <w:tc>
+          <w:tcPr>
+            <w:tcW w:type="dxa" w:w="3249"/>
+          </w:tcPr>
+          <w:p>
+            <w:r/>
+            <w:r>
+              <w:rPr>
+                <w:sz w:val="18"/>
+              </w:rPr>
+              <w:t>Sim</w:t>
+            </w:r>
+          </w:p>
+        </w:tc>
+        <w:tc>
+          <w:tcPr>
+            <w:tcW w:type="dxa" w:w="3249"/>
+          </w:tcPr>
+          <w:p>
+            <w:r/>
+            <w:r>
+              <w:rPr>
+                <w:sz w:val="18"/>
+              </w:rPr>
+              <w:t>Sim</w:t>
+            </w:r>
+          </w:p>
+        </w:tc>
+      </w:tr>
+      <w:tr>
+        <w:tc>
+          <w:tcPr>
+            <w:tcW w:type="dxa" w:w="3249"/>
+          </w:tcPr>
+          <w:p>
+            <w:r/>
+            <w:r>
+              <w:rPr>
+                <w:sz w:val="18"/>
+              </w:rPr>
+              <w:t>Certificado SSL</w:t>
+            </w:r>
+          </w:p>
+        </w:tc>
+        <w:tc>
+          <w:tcPr>
+            <w:tcW w:type="dxa" w:w="3249"/>
+          </w:tcPr>
+          <w:p>
+            <w:r/>
+            <w:r>
+              <w:rPr>
+                <w:sz w:val="18"/>
+              </w:rPr>
+              <w:t>Sim</w:t>
+            </w:r>
+          </w:p>
+        </w:tc>
+        <w:tc>
+          <w:tcPr>
+            <w:tcW w:type="dxa" w:w="3249"/>
+          </w:tcPr>
+          <w:p>
+            <w:r/>
+            <w:r>
+              <w:rPr>
+                <w:sz w:val="18"/>
+              </w:rPr>
+              <w:t>Sim</w:t>
+            </w:r>
+          </w:p>
+        </w:tc>
+      </w:tr>
+      <w:tr>
+        <w:tc>
+          <w:tcPr>
+            <w:tcW w:type="dxa" w:w="3249"/>
+          </w:tcPr>
+          <w:p>
+            <w:r/>
+            <w:r>
+              <w:rPr>
+                <w:sz w:val="18"/>
+              </w:rPr>
+              <w:t>Monitoramento 24/7 com alertas</w:t>
+            </w:r>
+          </w:p>
+        </w:tc>
+        <w:tc>
+          <w:tcPr>
+            <w:tcW w:type="dxa" w:w="3249"/>
+          </w:tcPr>
+          <w:p>
+            <w:r/>
+            <w:r>
+              <w:rPr>
+                <w:sz w:val="18"/>
+              </w:rPr>
+              <w:t>Sim</w:t>
+            </w:r>
+          </w:p>
+        </w:tc>
+        <w:tc>
+          <w:tcPr>
+            <w:tcW w:type="dxa" w:w="3249"/>
+          </w:tcPr>
+          <w:p>
+            <w:r/>
+            <w:r>
+              <w:rPr>
+                <w:sz w:val="18"/>
+              </w:rPr>
+              <w:t>Sim</w:t>
+            </w:r>
+          </w:p>
+        </w:tc>
+      </w:tr>
+      <w:tr>
+        <w:tc>
+          <w:tcPr>
+            <w:tcW w:type="dxa" w:w="3249"/>
+          </w:tcPr>
+          <w:p>
+            <w:r/>
+            <w:r>
+              <w:rPr>
+                <w:sz w:val="18"/>
+              </w:rPr>
+              <w:t>Atualiza��es de seguran�a e bibliotecas</w:t>
+            </w:r>
+          </w:p>
+        </w:tc>
+        <w:tc>
+          <w:tcPr>
+            <w:tcW w:type="dxa" w:w="3249"/>
+          </w:tcPr>
+          <w:p>
+            <w:r/>
+            <w:r>
+              <w:rPr>
+                <w:sz w:val="18"/>
+              </w:rPr>
+              <w:t>Sim</w:t>
+            </w:r>
+          </w:p>
+        </w:tc>
+        <w:tc>
+          <w:tcPr>
+            <w:tcW w:type="dxa" w:w="3249"/>
+          </w:tcPr>
+          <w:p>
+            <w:r/>
+            <w:r>
+              <w:rPr>
+                <w:sz w:val="18"/>
+              </w:rPr>
+              <w:t>Sim</w:t>
+            </w:r>
+          </w:p>
+        </w:tc>
+      </w:tr>
+      <w:tr>
+        <w:tc>
+          <w:tcPr>
+            <w:tcW w:type="dxa" w:w="3249"/>
+          </w:tcPr>
+          <w:p>
+            <w:r/>
+            <w:r>
+              <w:rPr>
+                <w:sz w:val="18"/>
+              </w:rPr>
+              <w:t>Horas de suporte mensal inclu�das</w:t>
+            </w:r>
+          </w:p>
+        </w:tc>
+        <w:tc>
+          <w:tcPr>
+            <w:tcW w:type="dxa" w:w="3249"/>
+          </w:tcPr>
+          <w:p>
+            <w:r/>
+            <w:r>
+              <w:rPr>
+                <w:sz w:val="18"/>
+              </w:rPr>
+              <w:t>2h</w:t>
+            </w:r>
+          </w:p>
+        </w:tc>
+        <w:tc>
+          <w:tcPr>
+            <w:tcW w:type="dxa" w:w="3249"/>
+          </w:tcPr>
+          <w:p>
+            <w:r/>
+            <w:r>
+              <w:rPr>
+                <w:sz w:val="18"/>
+              </w:rPr>
+              <w:t>4h</w:t>
+            </w:r>
+          </w:p>
+        </w:tc>
+      </w:tr>
+      <w:tr>
+        <w:tc>
+          <w:tcPr>
+            <w:tcW w:type="dxa" w:w="3249"/>
+          </w:tcPr>
+          <w:p>
+            <w:r/>
+            <w:r>
+              <w:rPr>
+                <w:sz w:val="18"/>
+              </w:rPr>
+              <w:t>SLA de resposta</w:t>
+            </w:r>
+          </w:p>
+        </w:tc>
+        <w:tc>
+          <w:tcPr>
+            <w:tcW w:type="dxa" w:w="3249"/>
+          </w:tcPr>
+          <w:p>
+            <w:r/>
+            <w:r>
+              <w:rPr>
+                <w:sz w:val="18"/>
+              </w:rPr>
+              <w:t>24h �teis</w:t>
+            </w:r>
+          </w:p>
+        </w:tc>
+        <w:tc>
+          <w:tcPr>
+            <w:tcW w:type="dxa" w:w="3249"/>
+          </w:tcPr>
+          <w:p>
+            <w:r/>
+            <w:r>
+              <w:rPr>
+                <w:sz w:val="18"/>
+              </w:rPr>
+              <w:t>8h �teis</w:t>
+            </w:r>
+          </w:p>
+        </w:tc>
+      </w:tr>
+      <w:tr>
+        <w:tc>
+          <w:tcPr>
+            <w:tcW w:type="dxa" w:w="3249"/>
+          </w:tcPr>
+          <w:p>
+            <w:r/>
+            <w:r>
+              <w:rPr>
+                <w:sz w:val="18"/>
+              </w:rPr>
+              <w:t>Hora excedente de suporte</w:t>
+            </w:r>
+          </w:p>
+        </w:tc>
+        <w:tc>
+          <w:tcPr>
+            <w:tcW w:type="dxa" w:w="3249"/>
+          </w:tcPr>
+          <w:p>
+            <w:r/>
+            <w:r>
+              <w:rPr>
+                <w:sz w:val="18"/>
+              </w:rPr>
+              <w:t>R$ 180,00/h</w:t>
+            </w:r>
+          </w:p>
+        </w:tc>
+        <w:tc>
+          <w:tcPr>
+            <w:tcW w:type="dxa" w:w="3249"/>
+          </w:tcPr>
+          <w:p>
+            <w:r/>
+            <w:r>
+              <w:rPr>
+                <w:sz w:val="18"/>
+              </w:rPr>
+              <w:t>R$ 150,00/h</w:t>
+            </w:r>
+          </w:p>
+        </w:tc>
+      </w:tr>
+    </w:tbl>
+    <w:p>
+      <w:pPr>
+        <w:spacing w:after="120"/>
+      </w:pPr>
+      <w:r>
+        <w:rPr>
+          <w:color w:val="6B6B6B"/>
+          <w:sz w:val="18"/>
+        </w:rPr>
+        <w:t>A mensalidade � cobrada a partir do m�s seguinte ao go-live da plataforma. Custos extras de cloud (storage acima de 200 GB ou egress acima de 300 GB/m�s) s�o repassados ao custo, mediante aviso pr�vio.</w:t>
+      </w:r>
+    </w:p>
+    <w:p>
+      <w:pPr>
+        <w:spacing w:before="200" w:after="80"/>
+      </w:pPr>
+      <w:r>
+        <w:rPr>
+          <w:b/>
+          <w:color w:val="1A1A1A"/>
+          <w:sz w:val="22"/>
+        </w:rPr>
+        <w:t>Prazo de desenvolvimento</w:t>
+      </w:r>
+    </w:p>
+    <w:p>
+      <w:pPr>
+        <w:spacing w:after="120"/>
+      </w:pPr>
+      <w:r>
+        <w:rPr>
+          <w:sz w:val="20"/>
+        </w:rPr>
+        <w:t>A evolu��o tem prazo estimado de 45 a 60 dias �teis entre a assinatura do adendo e o go-live, sujeito a valida��es de design e homologa��o com o cliente.</w:t>
+      </w:r>
+    </w:p>
+    <w:p>
+      <w:pPr>
+        <w:spacing w:before="200" w:after="80"/>
+      </w:pPr>
+      <w:r>
+        <w:rPr>
+          <w:b/>
+          <w:color w:val="1A1A1A"/>
+          <w:sz w:val="22"/>
+        </w:rPr>
+        <w:t>Validade desta oferta</w:t>
+      </w:r>
+    </w:p>
+    <w:p>
+      <w:pPr>
+        <w:spacing w:after="120"/>
+      </w:pPr>
+      <w:r>
+        <w:rPr>
+          <w:b/>
+          <w:sz w:val="20"/>
+        </w:rPr>
+        <w:t>Este adendo � v�lido por 12 meses a partir da data de assinatura da proposta principal. Ap�s esse prazo, valores e condi��es est�o sujeitos a revis�o.</w:t>
+      </w:r>
+    </w:p>
+    <w:p>
+      <w:pPr>
+        <w:spacing w:before="360" w:after="120"/>
+        <w:pBdr>
+          <w:bottom w:val="single" w:sz="6" w:space="1" w:color="E2E2E2"/>
+        </w:pBdr>
+      </w:pPr>
+      <w:r>
+        <w:rPr>
+          <w:b/>
+          <w:color w:val="0A7D4E"/>
+          <w:sz w:val="28"/>
+        </w:rPr>
+        <w:t>12. Aceite</w:t>
       </w:r>
     </w:p>
     <w:p>

</xml_diff>